<commit_message>
Update portfolio Confluence evidence links
</commit_message>
<xml_diff>
--- a/Ge_Zhao_Portfolio/25244738_rookie_portfolio.docx
+++ b/Ge_Zhao_Portfolio/25244738_rookie_portfolio.docx
@@ -4067,7 +4067,7 @@
         <w:t xml:space="preserve">Appendix B: Links and File Map</w:t>
       </w:r>
     </w:p>
-    <w:bookmarkStart w:id="111" w:name="important-links"/>
+    <w:bookmarkStart w:id="113" w:name="important-links"/>
     <w:p>
       <w:pPr>
         <w:pStyle w:val="Heading3"/>
@@ -4131,6 +4131,52 @@
         </w:numPr>
       </w:pPr>
       <w:r>
+        <w:t xml:space="preserve">Project Confluence documentation:</w:t>
+      </w:r>
+      <w:r>
+        <w:t xml:space="preserve"> </w:t>
+      </w:r>
+      <w:hyperlink r:id="rId111">
+        <w:r>
+          <w:rPr>
+            <w:rStyle w:val="Hyperlink"/>
+          </w:rPr>
+          <w:t xml:space="preserve">https://ai-studio-rookie.atlassian.net/wiki/spaces/A/overview?homepageId=163949</w:t>
+        </w:r>
+      </w:hyperlink>
+    </w:p>
+    <w:p>
+      <w:pPr>
+        <w:pStyle w:val="Compact"/>
+        <w:numPr>
+          <w:ilvl w:val="0"/>
+          <w:numId w:val="1008"/>
+        </w:numPr>
+      </w:pPr>
+      <w:r>
+        <w:t xml:space="preserve">Personal reflective journals:</w:t>
+      </w:r>
+      <w:r>
+        <w:t xml:space="preserve"> </w:t>
+      </w:r>
+      <w:hyperlink r:id="rId112">
+        <w:r>
+          <w:rPr>
+            <w:rStyle w:val="Hyperlink"/>
+          </w:rPr>
+          <w:t xml:space="preserve">https://ai-studio-rookie.atlassian.net/wiki/spaces/A/pages/3276856/Reflective+Journals_Ge+Zhao</w:t>
+        </w:r>
+      </w:hyperlink>
+    </w:p>
+    <w:p>
+      <w:pPr>
+        <w:pStyle w:val="Compact"/>
+        <w:numPr>
+          <w:ilvl w:val="0"/>
+          <w:numId w:val="1008"/>
+        </w:numPr>
+      </w:pPr>
+      <w:r>
         <w:t xml:space="preserve">KonIQ-10k data source:</w:t>
       </w:r>
       <w:r>
@@ -4145,7 +4191,7 @@
         </w:r>
       </w:hyperlink>
     </w:p>
-    <w:bookmarkEnd w:id="111"/>
+    <w:bookmarkEnd w:id="113"/>
     <w:bookmarkStart w:id="129" w:name="online-evidence-files-used"/>
     <w:p>
       <w:pPr>
@@ -4210,7 +4256,7 @@
             <w:pPr>
               <w:pStyle w:val="Compact"/>
             </w:pPr>
-            <w:hyperlink r:id="rId112">
+            <w:hyperlink r:id="rId114">
               <w:r>
                 <w:rPr>
                   <w:rStyle w:val="Hyperlink"/>
@@ -4224,7 +4270,7 @@
             <w:r>
               <w:t xml:space="preserve"> </w:t>
             </w:r>
-            <w:hyperlink r:id="rId113">
+            <w:hyperlink r:id="rId115">
               <w:r>
                 <w:rPr>
                   <w:rStyle w:val="Hyperlink"/>
@@ -4238,7 +4284,7 @@
             <w:r>
               <w:t xml:space="preserve"> </w:t>
             </w:r>
-            <w:hyperlink r:id="rId114">
+            <w:hyperlink r:id="rId116">
               <w:r>
                 <w:rPr>
                   <w:rStyle w:val="Hyperlink"/>
@@ -4252,7 +4298,7 @@
             <w:r>
               <w:t xml:space="preserve"> </w:t>
             </w:r>
-            <w:hyperlink r:id="rId115">
+            <w:hyperlink r:id="rId117">
               <w:r>
                 <w:rPr>
                   <w:rStyle w:val="Hyperlink"/>
@@ -4281,7 +4327,7 @@
             <w:pPr>
               <w:pStyle w:val="Compact"/>
             </w:pPr>
-            <w:hyperlink r:id="rId116">
+            <w:hyperlink r:id="rId118">
               <w:r>
                 <w:rPr>
                   <w:rStyle w:val="Hyperlink"/>
@@ -4295,7 +4341,7 @@
             <w:r>
               <w:t xml:space="preserve"> </w:t>
             </w:r>
-            <w:hyperlink r:id="rId117">
+            <w:hyperlink r:id="rId119">
               <w:r>
                 <w:rPr>
                   <w:rStyle w:val="Hyperlink"/>
@@ -4309,7 +4355,7 @@
             <w:r>
               <w:t xml:space="preserve"> </w:t>
             </w:r>
-            <w:hyperlink r:id="rId118">
+            <w:hyperlink r:id="rId120">
               <w:r>
                 <w:rPr>
                   <w:rStyle w:val="Hyperlink"/>
@@ -4323,7 +4369,7 @@
             <w:r>
               <w:t xml:space="preserve"> </w:t>
             </w:r>
-            <w:hyperlink r:id="rId119">
+            <w:hyperlink r:id="rId121">
               <w:r>
                 <w:rPr>
                   <w:rStyle w:val="Hyperlink"/>
@@ -4352,7 +4398,7 @@
             <w:pPr>
               <w:pStyle w:val="Compact"/>
             </w:pPr>
-            <w:hyperlink r:id="rId120">
+            <w:hyperlink r:id="rId122">
               <w:r>
                 <w:rPr>
                   <w:rStyle w:val="Hyperlink"/>
@@ -4366,7 +4412,7 @@
             <w:r>
               <w:t xml:space="preserve"> </w:t>
             </w:r>
-            <w:hyperlink r:id="rId121">
+            <w:hyperlink r:id="rId123">
               <w:r>
                 <w:rPr>
                   <w:rStyle w:val="Hyperlink"/>
@@ -4380,7 +4426,7 @@
             <w:r>
               <w:t xml:space="preserve"> </w:t>
             </w:r>
-            <w:hyperlink r:id="rId122">
+            <w:hyperlink r:id="rId124">
               <w:r>
                 <w:rPr>
                   <w:rStyle w:val="Hyperlink"/>
@@ -4409,7 +4455,7 @@
             <w:pPr>
               <w:pStyle w:val="Compact"/>
             </w:pPr>
-            <w:hyperlink r:id="rId123">
+            <w:hyperlink r:id="rId125">
               <w:r>
                 <w:rPr>
                   <w:rStyle w:val="Hyperlink"/>
@@ -4423,7 +4469,7 @@
             <w:r>
               <w:t xml:space="preserve"> </w:t>
             </w:r>
-            <w:hyperlink r:id="rId124">
+            <w:hyperlink r:id="rId126">
               <w:r>
                 <w:rPr>
                   <w:rStyle w:val="Hyperlink"/>
@@ -4452,7 +4498,7 @@
             <w:pPr>
               <w:pStyle w:val="Compact"/>
             </w:pPr>
-            <w:hyperlink r:id="rId125">
+            <w:hyperlink r:id="rId127">
               <w:r>
                 <w:rPr>
                   <w:rStyle w:val="Hyperlink"/>
@@ -4466,7 +4512,7 @@
             <w:r>
               <w:t xml:space="preserve"> </w:t>
             </w:r>
-            <w:hyperlink r:id="rId126">
+            <w:hyperlink r:id="rId128">
               <w:r>
                 <w:rPr>
                   <w:rStyle w:val="Hyperlink"/>
@@ -4495,29 +4541,26 @@
             <w:pPr>
               <w:pStyle w:val="Compact"/>
             </w:pPr>
-            <w:hyperlink r:id="rId127">
+            <w:hyperlink r:id="rId112">
               <w:r>
                 <w:rPr>
                   <w:rStyle w:val="Hyperlink"/>
                 </w:rPr>
-                <w:t xml:space="preserve">final portfolio PDF</w:t>
+                <w:t xml:space="preserve">personal reflective journal page in Confluence</w:t>
               </w:r>
             </w:hyperlink>
             <w:r>
+              <w:t xml:space="preserve">,</w:t>
+            </w:r>
+            <w:r>
               <w:t xml:space="preserve"> </w:t>
             </w:r>
-            <w:r>
-              <w:t xml:space="preserve">and</w:t>
-            </w:r>
-            <w:r>
-              <w:t xml:space="preserve"> </w:t>
-            </w:r>
-            <w:hyperlink r:id="rId128">
+            <w:hyperlink r:id="rId111">
               <w:r>
                 <w:rPr>
                   <w:rStyle w:val="Hyperlink"/>
                 </w:rPr>
-                <w:t xml:space="preserve">editable HTML source</w:t>
+                <w:t xml:space="preserve">team Confluence documentation space</w:t>
               </w:r>
             </w:hyperlink>
           </w:p>

</xml_diff>